<commit_message>
pp-salygos: šablonai - DPS sukūrimo sąlygų 9.1 ir 9.4 p. (kablelis, 2 priedo pavadinimas, EN)
sablonu-taisymai.py U (naudotojo prašymas „DPS sąlygų 9.1 punktas“ ir patvirtinimas dėl 9.4 p.), su žemėlapiais ir
raudono teksto patikra, pakartotinai - 0: DPS sukūrimo sąlygų (LT ir LT/EN) 9.1 p. - „kurių pajėgumais tiekėjai
remiasi, ir, kai taikoma“; 2 priedo pavadinimas 9.1 ir 9.4 p. - kaip pačiame priede, turinyje ir priedų sąraše
(„... ir reikalaujami aplinkos apsaugos vadybos sistemų standartai“; buvo „kokybės bei“ ir „reikalavimai laikytis ...
standartų“, EN „Quality and“); EN 9.1 p. - kokybės vadybos sistemos reikalavimai ir „and/or“, kaip LT. 8 vietos;
konkretaus pirkimo sąlygų 9.1 p. klaidų neturėjo. formu-versijos.json perskaičiuota. Testai 133 -> 134.

Co-Authored-By: Claude Opus 5.5 <noreply@anthropic.com>
</commit_message>
<xml_diff>
--- a/PP-salygos/templates/DPSK_LTEN_SALYGOS.docx
+++ b/PP-salygos/templates/DPSK_LTEN_SALYGOS.docx
@@ -18841,7 +18841,7 @@
                 <w:sz w:val="20"/>
                 <w:szCs w:val="20"/>
               </w:rPr>
-              <w:t>Tiekėjams, ūkio subjektams, kurių pajėgumais tiekėjai remiasi ir, kai taikoma, subtiekėjams nustatomi kvalifikacijos reikalavimai ir (arba) reikalavimai dėl kokybės vadybos sistemos ir (arba) aplinkos apsaugos vadybos sistemos standartų laikymosi ir jų atitiktį patvirtinantys dokumentai nurodyti šių sąlygų 2 priede „Tiekėjų kvalifikacijos reikalavimai ir reikalaujami kokybės bei aplinkos apsaugos vadybos sistemų standartai“.</w:t>
+              <w:t>Tiekėjams, ūkio subjektams, kurių pajėgumais tiekėjai remiasi, ir, kai taikoma, subtiekėjams nustatomi kvalifikacijos reikalavimai ir (arba) reikalavimai dėl kokybės vadybos sistemos ir (arba) aplinkos apsaugos vadybos sistemos standartų laikymosi ir jų atitiktį patvirtinantys dokumentai nurodyti šių sąlygų 2 priede „Tiekėjų kvalifikacijos reikalavimai ir reikalaujami aplinkos apsaugos vadybos sistemų standartai“.</w:t>
             </w:r>
           </w:p>
         </w:tc>
@@ -18873,7 +18873,7 @@
                 <w:szCs w:val="20"/>
                 <w:lang w:val="en-US"/>
               </w:rPr>
-              <w:t xml:space="preserve">Qualification requirements and required environmental management system standards for suppliers, </w:t>
+              <w:t xml:space="preserve">Qualification requirements and/or requirements regarding compliance with quality management system and/or environmental management system standards for suppliers, </w:t>
             </w:r>
             <w:r>
               <w:rPr>
@@ -18891,7 +18891,7 @@
                 <w:szCs w:val="20"/>
                 <w:lang w:val="en-US"/>
               </w:rPr>
-              <w:t>conomic entities on whose capacities suppliers rely, and, where applicable, sub-suppliers, as well as documents confirming their compliance, are specified in Annex 2 of these conditions, "Qualification Requirements and Required Quality and Environmental Management System Standards"</w:t>
+              <w:t>conomic entities on whose capacities suppliers rely, and, where applicable, sub-suppliers, as well as documents confirming their compliance, are specified in Annex 2 of these conditions, "Qualification Requirements and Required Environmental Management System Standards"</w:t>
             </w:r>
             <w:r>
               <w:rPr>
@@ -19168,7 +19168,7 @@
                 <w:sz w:val="20"/>
                 <w:szCs w:val="20"/>
               </w:rPr>
-              <w:t>Užsienio valstybės tiekėjo valstybėje išduoti šių dokumentų 2 priede „Tiekėjų kvalifikacijos reikalavimai ir reikalavimai laikytis aplinkos apsaugos vadybos sistemų standartų“ nurodyti dokumentai legalizuojami vadovaujantis Dokumentų legalizavimo ir tvirtinimo pažyma (Apostille) tvarkos aprašu, patvirtintu Lietuvos Respublikos Vyriausybės 2006 m. spalio 30 d. nutarimu Nr. 1079, ir 1961 m. spalio 5 d. Hagos konvencija dėl užsienio valstybėse išduotų dokumentų legalizavimo panaikinimo, išskyrus atvejus, kai pagal Lietuvos Respublikos tarptautines sutartis ar Europos Sąjungos teisės aktus dokumentas yra atleistas nuo legalizavimo ir (ar) tvirtinimo žymos (Apostille).</w:t>
+              <w:t>Užsienio valstybės tiekėjo valstybėje išduoti šių dokumentų 2 priede „Tiekėjų kvalifikacijos reikalavimai ir reikalaujami aplinkos apsaugos vadybos sistemų standartai“ nurodyti dokumentai legalizuojami vadovaujantis Dokumentų legalizavimo ir tvirtinimo pažyma (Apostille) tvarkos aprašu, patvirtintu Lietuvos Respublikos Vyriausybės 2006 m. spalio 30 d. nutarimu Nr. 1079, ir 1961 m. spalio 5 d. Hagos konvencija dėl užsienio valstybėse išduotų dokumentų legalizavimo panaikinimo, išskyrus atvejus, kai pagal Lietuvos Respublikos tarptautines sutartis ar Europos Sąjungos teisės aktus dokumentas yra atleistas nuo legalizavimo ir (ar) tvirtinimo žymos (Apostille).</w:t>
             </w:r>
           </w:p>
         </w:tc>

</xml_diff>

<commit_message>
pp-salygos: naudotojo sprendimai - DPS sukūrimo 8.2-8.5 p. visada (šablonų taisymas AQ), ūkio subjektų forma be kvalifikacijos dalių, kai tikrinami tik pašalinimo pagrindai
Co-Authored-By: Claude Opus 5.5 <noreply@anthropic.com>
</commit_message>
<xml_diff>
--- a/PP-salygos/templates/DPSK_LTEN_SALYGOS.docx
+++ b/PP-salygos/templates/DPSK_LTEN_SALYGOS.docx
@@ -18007,7 +18007,6 @@
             <w:r>
               <w:rPr>
                 <w:rFonts w:ascii="Arial" w:hAnsi="Arial" w:cs="Arial"/>
-                <w:color w:val="FF0000"/>
                 <w:sz w:val="20"/>
                 <w:szCs w:val="20"/>
               </w:rPr>
@@ -18016,7 +18015,6 @@
             <w:r>
               <w:rPr>
                 <w:rFonts w:ascii="Arial" w:hAnsi="Arial" w:cs="Arial"/>
-                <w:color w:val="FF0000"/>
                 <w:sz w:val="20"/>
                 <w:szCs w:val="20"/>
               </w:rPr>
@@ -18049,7 +18047,6 @@
             <w:r>
               <w:rPr>
                 <w:rFonts w:ascii="Arial" w:hAnsi="Arial" w:cs="Arial"/>
-                <w:color w:val="FF0000"/>
                 <w:sz w:val="20"/>
                 <w:szCs w:val="20"/>
                 <w:lang w:val="en-US"/>
@@ -18060,7 +18057,6 @@
             <w:r>
               <w:rPr>
                 <w:rFonts w:ascii="Arial" w:hAnsi="Arial" w:cs="Arial"/>
-                <w:color w:val="FF0000"/>
                 <w:sz w:val="20"/>
                 <w:szCs w:val="20"/>
                 <w:lang w:val="en-US"/>
@@ -18070,7 +18066,6 @@
             <w:r>
               <w:rPr>
                 <w:rFonts w:ascii="Arial" w:hAnsi="Arial" w:cs="Arial"/>
-                <w:color w:val="FF0000"/>
                 <w:sz w:val="20"/>
                 <w:szCs w:val="20"/>
                 <w:lang w:val="en-US"/>
@@ -18080,7 +18075,6 @@
             <w:r>
               <w:rPr>
                 <w:rFonts w:ascii="Arial" w:hAnsi="Arial" w:cs="Arial"/>
-                <w:color w:val="FF0000"/>
                 <w:sz w:val="20"/>
                 <w:szCs w:val="20"/>
                 <w:lang w:val="en-US"/>
@@ -18090,7 +18084,6 @@
             <w:r>
               <w:rPr>
                 <w:rFonts w:ascii="Arial" w:hAnsi="Arial" w:cs="Arial"/>
-                <w:color w:val="FF0000"/>
                 <w:sz w:val="20"/>
                 <w:szCs w:val="20"/>
                 <w:lang w:val="en-US"/>
@@ -18100,7 +18093,6 @@
             <w:r>
               <w:rPr>
                 <w:rFonts w:ascii="Arial" w:hAnsi="Arial" w:cs="Arial"/>
-                <w:color w:val="FF0000"/>
                 <w:sz w:val="20"/>
                 <w:szCs w:val="20"/>
                 <w:lang w:val="en-US"/>
@@ -18111,7 +18103,6 @@
             <w:r>
               <w:rPr>
                 <w:rFonts w:ascii="Arial" w:hAnsi="Arial" w:cs="Arial"/>
-                <w:color w:val="FF0000"/>
                 <w:sz w:val="20"/>
                 <w:szCs w:val="20"/>
                 <w:lang w:val="en-US"/>
@@ -18121,7 +18112,6 @@
             <w:r>
               <w:rPr>
                 <w:rFonts w:ascii="Arial" w:hAnsi="Arial" w:cs="Arial"/>
-                <w:color w:val="FF0000"/>
                 <w:sz w:val="20"/>
                 <w:szCs w:val="20"/>
                 <w:lang w:val="en-US"/>
@@ -18176,7 +18166,6 @@
             <w:r>
               <w:rPr>
                 <w:rFonts w:ascii="Arial" w:hAnsi="Arial" w:cs="Arial"/>
-                <w:color w:val="FF0000"/>
                 <w:sz w:val="20"/>
                 <w:szCs w:val="20"/>
               </w:rPr>
@@ -18208,7 +18197,6 @@
             <w:r>
               <w:rPr>
                 <w:rFonts w:ascii="Arial" w:hAnsi="Arial" w:cs="Arial"/>
-                <w:color w:val="FF0000"/>
                 <w:sz w:val="20"/>
                 <w:szCs w:val="20"/>
                 <w:lang w:val="en-US"/>
@@ -18218,7 +18206,6 @@
             <w:r>
               <w:rPr>
                 <w:rFonts w:ascii="Arial" w:hAnsi="Arial" w:cs="Arial"/>
-                <w:color w:val="FF0000"/>
                 <w:sz w:val="20"/>
                 <w:szCs w:val="20"/>
                 <w:lang w:val="en-US"/>
@@ -18228,7 +18215,6 @@
             <w:r>
               <w:rPr>
                 <w:rFonts w:ascii="Arial" w:hAnsi="Arial" w:cs="Arial"/>
-                <w:color w:val="FF0000"/>
                 <w:sz w:val="20"/>
                 <w:szCs w:val="20"/>
                 <w:lang w:val="en-US"/>
@@ -18238,7 +18224,6 @@
             <w:r>
               <w:rPr>
                 <w:rFonts w:ascii="Arial" w:hAnsi="Arial" w:cs="Arial"/>
-                <w:color w:val="FF0000"/>
                 <w:sz w:val="20"/>
                 <w:szCs w:val="20"/>
                 <w:lang w:val="en-US"/>
@@ -18248,7 +18233,6 @@
             <w:r>
               <w:rPr>
                 <w:rFonts w:ascii="Arial" w:hAnsi="Arial" w:cs="Arial"/>
-                <w:color w:val="FF0000"/>
                 <w:sz w:val="20"/>
                 <w:szCs w:val="20"/>
                 <w:lang w:val="en-US"/>
@@ -18258,7 +18242,6 @@
             <w:r>
               <w:rPr>
                 <w:rFonts w:ascii="Arial" w:hAnsi="Arial" w:cs="Arial"/>
-                <w:color w:val="FF0000"/>
                 <w:sz w:val="20"/>
                 <w:szCs w:val="20"/>
                 <w:lang w:val="en-US"/>
@@ -18312,11 +18295,10 @@
             <w:r>
               <w:rPr>
                 <w:rFonts w:ascii="Arial" w:hAnsi="Arial" w:cs="Arial"/>
-                <w:color w:val="FF0000"/>
-                <w:sz w:val="20"/>
-                <w:szCs w:val="20"/>
-              </w:rPr>
-              <w:t>Pirkimo vykdytojas taip pat patikrina, ar dėl ūkio subjektų, kurių pajėgumais ketina remtis tiekėjas, nėra šių sąlygų 1 priede „Tiekėjų pašalinimo pagrindai“  nustatytų pašalinimo pagrindų. Jeigu dėl ūkio subjekto yra bent vienas pašalinimo pagrindas,  pirkimo vykdytojas reikalaus per jo nustatytą terminą pakeisti jį kitu ūkio subjektu, dėl kurio nėra pašalinimo pagrindų.  Šio punkto nuostatos taikomos ir subtiekėjams, jeigu šių sąlygų 1 priede „Tiekėjų pašalinimo pagrindai“ nustatyta, kad pašalinimo pagrindai taikomi ir jiems.</w:t>
+                <w:sz w:val="20"/>
+                <w:szCs w:val="20"/>
+              </w:rPr>
+              <w:t>Pirkimo vykdytojas taip pat patikrina, ar dėl ūkio subjektų, kurių pajėgumais ketina remtis tiekėjas, nėra šių sąlygų 1 priede „Tiekėjų pašalinimo pagrindai“ nustatytų pašalinimo pagrindų. Jeigu dėl ūkio subjekto yra bent vienas pašalinimo pagrindas, pirkimo vykdytojas reikalaus per jo nustatytą terminą pakeisti jį kitu ūkio subjektu, dėl kurio nėra pašalinimo pagrindų. Šio punkto nuostatos taikomos ir subtiekėjams, jeigu šių sąlygų 1 priede „Tiekėjų pašalinimo pagrindai“ nustatyta, kad pašalinimo pagrindai taikomi ir jiems.</w:t>
             </w:r>
           </w:p>
         </w:tc>
@@ -18345,7 +18327,6 @@
             <w:r>
               <w:rPr>
                 <w:rFonts w:ascii="Arial" w:hAnsi="Arial" w:cs="Arial"/>
-                <w:color w:val="FF0000"/>
                 <w:sz w:val="20"/>
                 <w:szCs w:val="20"/>
                 <w:lang w:val="en-US"/>
@@ -18355,7 +18336,6 @@
             <w:r>
               <w:rPr>
                 <w:rFonts w:ascii="Arial" w:hAnsi="Arial" w:cs="Arial"/>
-                <w:color w:val="FF0000"/>
                 <w:sz w:val="20"/>
                 <w:szCs w:val="20"/>
                 <w:lang w:val="en-US"/>
@@ -18365,7 +18345,6 @@
             <w:r>
               <w:rPr>
                 <w:rFonts w:ascii="Arial" w:hAnsi="Arial" w:cs="Arial"/>
-                <w:color w:val="FF0000"/>
                 <w:sz w:val="20"/>
                 <w:szCs w:val="20"/>
                 <w:lang w:val="en-US"/>
@@ -18375,7 +18354,6 @@
             <w:r>
               <w:rPr>
                 <w:rFonts w:ascii="Arial" w:hAnsi="Arial" w:cs="Arial"/>
-                <w:color w:val="FF0000"/>
                 <w:sz w:val="20"/>
                 <w:szCs w:val="20"/>
                 <w:lang w:val="en-US"/>
@@ -18385,7 +18363,6 @@
             <w:r>
               <w:rPr>
                 <w:rFonts w:ascii="Arial" w:hAnsi="Arial" w:cs="Arial"/>
-                <w:color w:val="FF0000"/>
                 <w:sz w:val="20"/>
                 <w:szCs w:val="20"/>
                 <w:lang w:val="en-US"/>
@@ -18395,7 +18372,6 @@
             <w:r>
               <w:rPr>
                 <w:rFonts w:ascii="Arial" w:hAnsi="Arial" w:cs="Arial"/>
-                <w:color w:val="FF0000"/>
                 <w:sz w:val="20"/>
                 <w:szCs w:val="20"/>
                 <w:lang w:val="en-US"/>
@@ -18449,11 +18425,10 @@
             <w:r>
               <w:rPr>
                 <w:rFonts w:ascii="Arial" w:hAnsi="Arial" w:cs="Arial"/>
-                <w:color w:val="FF0000"/>
-                <w:sz w:val="20"/>
-                <w:szCs w:val="20"/>
-              </w:rPr>
-              <w:t>Nepaisant 8.2. ir 8.3. punktų nuostatų, tiekėjas iš pirkimo nepašalinamas VPĮ 46 straipsnio 3 ir 10  dalyse nustatytais atvejais (atsižvelgiant į VPĮ 46 straipsnio 11 ir 12 dalių nuostatas), taip pat jeigu pagal VPĮ 46 straipsnio 8 dalį vertindamas tiekėjo patikimumą pirkimo vykdytojas priėmė sprendimą, kad tiekėjo pašalinimas iš pirkimo procedūros būtų neproporcingas vertinamam tiekėjo elgesiui pirkimo vykdytojas priėmė sprendimą, kad esant nustatytam pašalinimo pagrindui pagal VPĮ 46 straipsnio 4 dalies 7 punkto c papunktį būtų reikšmingai apribota konkurencija. Priimant sprendimus dėl tiekėjo pašalinimo iš pirkimo procedūros 8.3 punkte nurodytais pašalinimo pagrindais gali būti atsižvelgiama į pagal VPĮ 52 ir 91 straipsnius arba PĮ 63 ir 99 straipsnius skelbiamą informaciją.</w:t>
+                <w:sz w:val="20"/>
+                <w:szCs w:val="20"/>
+              </w:rPr>
+              <w:t>Nepaisant 8.2. ir 8.3. punktų nuostatų, tiekėjas iš pirkimo nepašalinamas VPĮ 46 straipsnio 3 ir 10 dalyse nustatytais atvejais (atsižvelgiant į VPĮ 46 straipsnio 11 ir 12 dalių nuostatas), taip pat jeigu pagal VPĮ 46 straipsnio 8 dalį vertindamas tiekėjo patikimumą pirkimo vykdytojas priėmė sprendimą, kad tiekėjo pašalinimas iš pirkimo procedūros būtų neproporcingas vertinamam tiekėjo elgesiui pirkimo vykdytojas priėmė sprendimą, kad esant nustatytam pašalinimo pagrindui pagal VPĮ 46 straipsnio 4 dalies 7 punkto c papunktį būtų reikšmingai apribota konkurencija. Priimant sprendimus dėl tiekėjo pašalinimo iš pirkimo procedūros 8.3 punkte nurodytais pašalinimo pagrindais gali būti atsižvelgiama į pagal VPĮ 52 ir 91 straipsnius arba PĮ 63 ir 99 straipsnius skelbiamą informaciją.</w:t>
             </w:r>
           </w:p>
         </w:tc>
@@ -18481,7 +18456,6 @@
             <w:r>
               <w:rPr>
                 <w:rFonts w:ascii="Arial" w:hAnsi="Arial" w:cs="Arial"/>
-                <w:color w:val="FF0000"/>
                 <w:sz w:val="20"/>
                 <w:szCs w:val="20"/>
                 <w:lang w:val="en-US"/>

</xml_diff>